<commit_message>
chore(security): add supply chain security (CSS) pipeline
- Add Dependabot config for npm, pip, Docker and GitHub Actions
- Add security-scan workflow (TruffleHog, Trivy, Syft, Grype, Semgrep, Cosign)
- Add pre-commit hooks with TruffleHog + Gitleaks secret detection
- Pin all Docker base images by SHA256 digest
- Update SECURITY.md with CSS pipeline documentation

Co-Authored-By: Claude Opus 4.8 <noreply@anthropic.com>
</commit_message>
<xml_diff>
--- a/Documentation/FD03-EPIS-Informe SRS de Proyecto.docx
+++ b/Documentation/FD03-EPIS-Informe SRS de Proyecto.docx
@@ -435,59 +435,6 @@
         </w:rPr>
         <w:tab/>
         <w:t>(2019063854)</w:t>
-      </w:r>
-    </w:p>
-    <w:p>
-      <w:pPr>
-        <w:spacing w:after="0"/>
-        <w:rPr>
-          <w:rFonts w:ascii="Arial" w:eastAsia="Arial" w:hAnsi="Arial" w:cs="Arial"/>
-          <w:b/>
-          <w:i/>
-          <w:sz w:val="28"/>
-          <w:szCs w:val="28"/>
-        </w:rPr>
-      </w:pPr>
-      <w:r>
-        <w:rPr>
-          <w:rFonts w:ascii="Arial" w:eastAsia="Arial" w:hAnsi="Arial" w:cs="Arial"/>
-          <w:b/>
-          <w:i/>
-          <w:sz w:val="28"/>
-          <w:szCs w:val="28"/>
-        </w:rPr>
-        <w:t>Paja de la Cruz, Piero Alexander</w:t>
-      </w:r>
-      <w:r>
-        <w:rPr>
-          <w:rFonts w:ascii="Arial" w:eastAsia="Arial" w:hAnsi="Arial" w:cs="Arial"/>
-          <w:b/>
-          <w:i/>
-          <w:sz w:val="28"/>
-          <w:szCs w:val="28"/>
-        </w:rPr>
-        <w:tab/>
-      </w:r>
-      <w:r>
-        <w:rPr>
-          <w:rFonts w:ascii="Arial" w:eastAsia="Arial" w:hAnsi="Arial" w:cs="Arial"/>
-          <w:b/>
-          <w:i/>
-          <w:sz w:val="28"/>
-          <w:szCs w:val="28"/>
-        </w:rPr>
-        <w:tab/>
-      </w:r>
-      <w:r>
-        <w:rPr>
-          <w:rFonts w:ascii="Arial" w:eastAsia="Arial" w:hAnsi="Arial" w:cs="Arial"/>
-          <w:b/>
-          <w:i/>
-          <w:sz w:val="28"/>
-          <w:szCs w:val="28"/>
-        </w:rPr>
-        <w:tab/>
-        <w:t>(2020067576</w:t>
       </w:r>
     </w:p>
     <w:p>
@@ -1566,7 +1513,14 @@
                 <w:sz w:val="14"/>
                 <w:szCs w:val="14"/>
               </w:rPr>
-              <w:t>07</w:t>
+              <w:t>0</w:t>
+            </w:r>
+            <w:r>
+              <w:rPr>
+                <w:sz w:val="14"/>
+                <w:szCs w:val="14"/>
+              </w:rPr>
+              <w:t>6</w:t>
             </w:r>
             <w:r>
               <w:rPr>
@@ -1665,6 +1619,10 @@
     <w:sdt>
       <w:sdtPr>
         <w:rPr>
+          <w:b w:val="0"/>
+          <w:bCs w:val="0"/>
+          <w:sz w:val="22"/>
+          <w:szCs w:val="22"/>
           <w:lang w:val="es-ES"/>
         </w:rPr>
         <w:id w:val="-1446851921"/>
@@ -1673,12 +1631,6 @@
           <w:docPartUnique/>
         </w:docPartObj>
       </w:sdtPr>
-      <w:sdtEndPr>
-        <w:rPr>
-          <w:sz w:val="22"/>
-          <w:szCs w:val="22"/>
-        </w:rPr>
-      </w:sdtEndPr>
       <w:sdtContent>
         <w:p>
           <w:pPr>
@@ -15727,24 +15679,6 @@
           <w:rFonts w:ascii="Arial" w:hAnsi="Arial" w:cs="Arial"/>
           <w:sz w:val="24"/>
           <w:szCs w:val="24"/>
-        </w:rPr>
-      </w:pPr>
-      <w:r>
-        <w:rPr>
-          <w:rFonts w:ascii="Arial" w:hAnsi="Arial" w:cs="Arial"/>
-          <w:sz w:val="24"/>
-          <w:szCs w:val="24"/>
-        </w:rPr>
-        <w:t>Ministerio de Salud del Perú. (2024). "Análisis de Situación de Salud - Región Tacna". Lima: MINSA.</w:t>
-      </w:r>
-    </w:p>
-    <w:p>
-      <w:pPr>
-        <w:jc w:val="both"/>
-        <w:rPr>
-          <w:rFonts w:ascii="Arial" w:hAnsi="Arial" w:cs="Arial"/>
-          <w:sz w:val="24"/>
-          <w:szCs w:val="24"/>
           <w:lang w:val="en-US"/>
         </w:rPr>
       </w:pPr>
@@ -15753,6 +15687,35 @@
           <w:rFonts w:ascii="Arial" w:hAnsi="Arial" w:cs="Arial"/>
           <w:sz w:val="24"/>
           <w:szCs w:val="24"/>
+        </w:rPr>
+        <w:t xml:space="preserve">Ministerio de Salud del Perú. (2024). "Análisis de Situación de Salud - Región Tacna". </w:t>
+      </w:r>
+      <w:r>
+        <w:rPr>
+          <w:rFonts w:ascii="Arial" w:hAnsi="Arial" w:cs="Arial"/>
+          <w:sz w:val="24"/>
+          <w:szCs w:val="24"/>
+          <w:lang w:val="en-US"/>
+        </w:rPr>
+        <w:t>Lima: MINSA.</w:t>
+      </w:r>
+    </w:p>
+    <w:p>
+      <w:pPr>
+        <w:jc w:val="both"/>
+        <w:rPr>
+          <w:rFonts w:ascii="Arial" w:hAnsi="Arial" w:cs="Arial"/>
+          <w:sz w:val="24"/>
+          <w:szCs w:val="24"/>
+          <w:lang w:val="en-US"/>
+        </w:rPr>
+      </w:pPr>
+      <w:r>
+        <w:rPr>
+          <w:rFonts w:ascii="Arial" w:hAnsi="Arial" w:cs="Arial"/>
+          <w:sz w:val="24"/>
+          <w:szCs w:val="24"/>
+          <w:lang w:val="en-US"/>
         </w:rPr>
         <w:t xml:space="preserve">Zhang, Y., et al. (2023). </w:t>
       </w:r>
@@ -20247,28 +20210,28 @@
 </file>
 
 <file path=customXml/item1.xml><?xml version="1.0" encoding="utf-8"?>
+<b:Sources xmlns:b="http://schemas.openxmlformats.org/officeDocument/2006/bibliography" xmlns="http://schemas.openxmlformats.org/officeDocument/2006/bibliography" SelectedStyle="\APASixthEditionOfficeOnline.xsl" StyleName="APA" Version="6"/>
+</file>
+
+<file path=customXml/item2.xml><?xml version="1.0" encoding="utf-8"?>
 <go:gDocsCustomXmlDataStorage xmlns:go="http://customooxmlschemas.google.com/" xmlns:r="http://schemas.openxmlformats.org/officeDocument/2006/relationships" uri="GoogleDocsCustomDataVersion2">
   <go:docsCustomData xmlns:go="http://customooxmlschemas.google.com/" roundtripDataSignature="AMtx7miKvwiRdv52amdJrMCDE2CmI1xQDw==">CgMxLjAaHwoBMBIaChgICVIUChJ0YWJsZS52Zm1pOHR6ODNwOTIyDmguam1nenJ1M2FvMWM5Mg5oLjJldXRzd25ncWdobDIOaC5qZG41MXc2bmR5NnM4AHIhMXNtVEF3NmJrd1BsYjJwZWdZUFJ0OVNpSko1Y1l1ZGt3</go:docsCustomData>
 </go:gDocsCustomXmlDataStorage>
 </file>
 
-<file path=customXml/item2.xml><?xml version="1.0" encoding="utf-8"?>
-<b:Sources xmlns:b="http://schemas.openxmlformats.org/officeDocument/2006/bibliography" xmlns="http://schemas.openxmlformats.org/officeDocument/2006/bibliography" SelectedStyle="\APASixthEditionOfficeOnline.xsl" StyleName="APA" Version="6"/>
+<file path=customXml/itemProps1.xml><?xml version="1.0" encoding="utf-8"?>
+<ds:datastoreItem xmlns:ds="http://schemas.openxmlformats.org/officeDocument/2006/customXml" ds:itemID="{848916AC-6C53-4CC4-B4B1-AE569E85CD9E}">
+  <ds:schemaRefs>
+    <ds:schemaRef ds:uri="http://schemas.openxmlformats.org/officeDocument/2006/bibliography"/>
+  </ds:schemaRefs>
+</ds:datastoreItem>
 </file>
 
-<file path=customXml/itemProps1.xml><?xml version="1.0" encoding="utf-8"?>
+<file path=customXml/itemProps2.xml><?xml version="1.0" encoding="utf-8"?>
 <ds:datastoreItem xmlns:ds="http://schemas.openxmlformats.org/officeDocument/2006/customXml" ds:itemID="{11111111-1234-1234-1234-123412341234}">
   <ds:schemaRefs>
     <ds:schemaRef ds:uri="http://customooxmlschemas.google.com/"/>
     <ds:schemaRef ds:uri="http://schemas.openxmlformats.org/officeDocument/2006/relationships"/>
   </ds:schemaRefs>
 </ds:datastoreItem>
-</file>
-
-<file path=customXml/itemProps2.xml><?xml version="1.0" encoding="utf-8"?>
-<ds:datastoreItem xmlns:ds="http://schemas.openxmlformats.org/officeDocument/2006/customXml" ds:itemID="{848916AC-6C53-4CC4-B4B1-AE569E85CD9E}">
-  <ds:schemaRefs>
-    <ds:schemaRef ds:uri="http://schemas.openxmlformats.org/officeDocument/2006/bibliography"/>
-  </ds:schemaRefs>
-</ds:datastoreItem>
 </file>
</xml_diff>